<commit_message>
add report for lab02
</commit_message>
<xml_diff>
--- a/labs/lab02/report/_output/report.docx
+++ b/labs/lab02/report/_output/report.docx
@@ -162,7 +162,7 @@
       </w:r>
     </w:p>
     <w:bookmarkEnd w:id="22"/>
-    <w:bookmarkStart w:id="73" w:name="выполнение-лабораторной-работы"/>
+    <w:bookmarkStart w:id="54" w:name="выполнение-лабораторной-работы"/>
     <w:p>
       <w:pPr>
         <w:pStyle w:val="Heading1"/>
@@ -833,13 +833,14 @@
       </w:r>
     </w:p>
     <w:bookmarkEnd w:id="53"/>
-    <w:bookmarkStart w:id="72" w:name="настройка-среды"/>
-    <w:p>
-      <w:pPr>
-        <w:pStyle w:val="Heading2"/>
-      </w:pPr>
-      <w:r>
-        <w:t xml:space="preserve">4.2 Настройка среды</w:t>
+    <w:bookmarkEnd w:id="54"/>
+    <w:bookmarkStart w:id="55" w:name="контрольные-вопросы"/>
+    <w:p>
+      <w:pPr>
+        <w:pStyle w:val="Heading1"/>
+      </w:pPr>
+      <w:r>
+        <w:t xml:space="preserve">5. Контрольные вопросы</w:t>
       </w:r>
     </w:p>
     <w:p>
@@ -847,62 +848,17 @@
         <w:pStyle w:val="FirstParagraph"/>
       </w:pPr>
       <w:r>
-        <w:t xml:space="preserve">После установки, перехожу на супер-пользователя для установки программ и установливаю средства разработки</w:t>
-      </w:r>
-    </w:p>
-    <w:p>
-      <w:pPr>
-        <w:pStyle w:val="CaptionedFigure"/>
-      </w:pPr>
-      <w:r>
-        <w:drawing>
-          <wp:inline>
-            <wp:extent cx="3733800" cy="766391"/>
-            <wp:effectExtent b="0" l="0" r="0" t="0"/>
-            <wp:docPr descr="Рис. 3" title="" id="54" name="Picture"/>
-            <a:graphic>
-              <a:graphicData uri="http://schemas.openxmlformats.org/drawingml/2006/picture">
-                <pic:pic>
-                  <pic:nvPicPr>
-                    <pic:cNvPr descr="image/2.png" id="55" name="Picture"/>
-                    <pic:cNvPicPr>
-                      <a:picLocks noChangeArrowheads="1" noChangeAspect="1"/>
-                    </pic:cNvPicPr>
-                  </pic:nvPicPr>
-                  <pic:blipFill>
-                    <a:blip r:embed="rId26"/>
-                    <a:stretch>
-                      <a:fillRect/>
-                    </a:stretch>
-                  </pic:blipFill>
-                  <pic:spPr bwMode="auto">
-                    <a:xfrm>
-                      <a:off x="0" y="0"/>
-                      <a:ext cx="3733800" cy="766391"/>
-                    </a:xfrm>
-                    <a:prstGeom prst="rect">
-                      <a:avLst/>
-                    </a:prstGeom>
-                    <a:noFill/>
-                    <a:ln w="9525">
-                      <a:noFill/>
-                      <a:headEnd/>
-                      <a:tailEnd/>
-                    </a:ln>
-                  </pic:spPr>
-                </pic:pic>
-              </a:graphicData>
-            </a:graphic>
-          </wp:inline>
-        </w:drawing>
-      </w:r>
-    </w:p>
-    <w:p>
-      <w:pPr>
-        <w:pStyle w:val="ImageCaption"/>
-      </w:pPr>
-      <w:r>
-        <w:t xml:space="preserve">Рис. 3</w:t>
+        <w:rPr>
+          <w:b/>
+          <w:bCs/>
+        </w:rPr>
+        <w:t xml:space="preserve">1. Что такое система контроля версий?</w:t>
+      </w:r>
+      <w:r>
+        <w:br/>
+      </w:r>
+      <w:r>
+        <w:t xml:space="preserve">Инструмент для фиксации изменений в файлах, позволяющий отслеживать историю, возвращаться к предыдущим версиям и совмещать правки разных авторов.</w:t>
       </w:r>
     </w:p>
     <w:p>
@@ -910,62 +866,17 @@
         <w:pStyle w:val="BodyText"/>
       </w:pPr>
       <w:r>
-        <w:t xml:space="preserve">Установливаю средства программного обеспечения</w:t>
-      </w:r>
-    </w:p>
-    <w:p>
-      <w:pPr>
-        <w:pStyle w:val="CaptionedFigure"/>
-      </w:pPr>
-      <w:r>
-        <w:drawing>
-          <wp:inline>
-            <wp:extent cx="3733800" cy="1896786"/>
-            <wp:effectExtent b="0" l="0" r="0" t="0"/>
-            <wp:docPr descr="Рис. 4" title="" id="56" name="Picture"/>
-            <a:graphic>
-              <a:graphicData uri="http://schemas.openxmlformats.org/drawingml/2006/picture">
-                <pic:pic>
-                  <pic:nvPicPr>
-                    <pic:cNvPr descr="image/3.png" id="57" name="Picture"/>
-                    <pic:cNvPicPr>
-                      <a:picLocks noChangeArrowheads="1" noChangeAspect="1"/>
-                    </pic:cNvPicPr>
-                  </pic:nvPicPr>
-                  <pic:blipFill>
-                    <a:blip r:embed="rId29"/>
-                    <a:stretch>
-                      <a:fillRect/>
-                    </a:stretch>
-                  </pic:blipFill>
-                  <pic:spPr bwMode="auto">
-                    <a:xfrm>
-                      <a:off x="0" y="0"/>
-                      <a:ext cx="3733800" cy="1896786"/>
-                    </a:xfrm>
-                    <a:prstGeom prst="rect">
-                      <a:avLst/>
-                    </a:prstGeom>
-                    <a:noFill/>
-                    <a:ln w="9525">
-                      <a:noFill/>
-                      <a:headEnd/>
-                      <a:tailEnd/>
-                    </a:ln>
-                  </pic:spPr>
-                </pic:pic>
-              </a:graphicData>
-            </a:graphic>
-          </wp:inline>
-        </w:drawing>
-      </w:r>
-    </w:p>
-    <w:p>
-      <w:pPr>
-        <w:pStyle w:val="ImageCaption"/>
-      </w:pPr>
-      <w:r>
-        <w:t xml:space="preserve">Рис. 4</w:t>
+        <w:rPr>
+          <w:b/>
+          <w:bCs/>
+        </w:rPr>
+        <w:t xml:space="preserve">2. Централизованные и распределённые VCS: в чём разница?</w:t>
+      </w:r>
+      <w:r>
+        <w:br/>
+      </w:r>
+      <w:r>
+        <w:t xml:space="preserve">Централизованные (SVN) хранят историю на одном сервере; распределённые (Git) дают каждому участнику полную копию репозитория, позволяя работать офлайн.</w:t>
       </w:r>
     </w:p>
     <w:p>
@@ -973,62 +884,92 @@
         <w:pStyle w:val="BodyText"/>
       </w:pPr>
       <w:r>
-        <w:t xml:space="preserve">Запускаю таймер</w:t>
-      </w:r>
-    </w:p>
-    <w:p>
-      <w:pPr>
-        <w:pStyle w:val="CaptionedFigure"/>
-      </w:pPr>
-      <w:r>
-        <w:drawing>
-          <wp:inline>
-            <wp:extent cx="3733800" cy="820704"/>
-            <wp:effectExtent b="0" l="0" r="0" t="0"/>
-            <wp:docPr descr="Рис. 5" title="" id="58" name="Picture"/>
-            <a:graphic>
-              <a:graphicData uri="http://schemas.openxmlformats.org/drawingml/2006/picture">
-                <pic:pic>
-                  <pic:nvPicPr>
-                    <pic:cNvPr descr="image/4.png" id="59" name="Picture"/>
-                    <pic:cNvPicPr>
-                      <a:picLocks noChangeArrowheads="1" noChangeAspect="1"/>
-                    </pic:cNvPicPr>
-                  </pic:nvPicPr>
-                  <pic:blipFill>
-                    <a:blip r:embed="rId32"/>
-                    <a:stretch>
-                      <a:fillRect/>
-                    </a:stretch>
-                  </pic:blipFill>
-                  <pic:spPr bwMode="auto">
-                    <a:xfrm>
-                      <a:off x="0" y="0"/>
-                      <a:ext cx="3733800" cy="820704"/>
-                    </a:xfrm>
-                    <a:prstGeom prst="rect">
-                      <a:avLst/>
-                    </a:prstGeom>
-                    <a:noFill/>
-                    <a:ln w="9525">
-                      <a:noFill/>
-                      <a:headEnd/>
-                      <a:tailEnd/>
-                    </a:ln>
-                  </pic:spPr>
-                </pic:pic>
-              </a:graphicData>
-            </a:graphic>
-          </wp:inline>
-        </w:drawing>
-      </w:r>
-    </w:p>
-    <w:p>
-      <w:pPr>
-        <w:pStyle w:val="ImageCaption"/>
-      </w:pPr>
-      <w:r>
-        <w:t xml:space="preserve">Рис. 5</w:t>
+        <w:rPr>
+          <w:b/>
+          <w:bCs/>
+        </w:rPr>
+        <w:t xml:space="preserve">3. Для чего нужны</w:t>
+      </w:r>
+      <w:r>
+        <w:rPr>
+          <w:b/>
+          <w:bCs/>
+        </w:rPr>
+        <w:t xml:space="preserve"> </w:t>
+      </w:r>
+      <w:r>
+        <w:rPr>
+          <w:rStyle w:val="VerbatimChar"/>
+          <w:b/>
+          <w:bCs/>
+        </w:rPr>
+        <w:t xml:space="preserve">git add</w:t>
+      </w:r>
+      <w:r>
+        <w:rPr>
+          <w:b/>
+          <w:bCs/>
+        </w:rPr>
+        <w:t xml:space="preserve"> </w:t>
+      </w:r>
+      <w:r>
+        <w:rPr>
+          <w:b/>
+          <w:bCs/>
+        </w:rPr>
+        <w:t xml:space="preserve">и</w:t>
+      </w:r>
+      <w:r>
+        <w:rPr>
+          <w:b/>
+          <w:bCs/>
+        </w:rPr>
+        <w:t xml:space="preserve"> </w:t>
+      </w:r>
+      <w:r>
+        <w:rPr>
+          <w:rStyle w:val="VerbatimChar"/>
+          <w:b/>
+          <w:bCs/>
+        </w:rPr>
+        <w:t xml:space="preserve">git commit</w:t>
+      </w:r>
+      <w:r>
+        <w:rPr>
+          <w:b/>
+          <w:bCs/>
+        </w:rPr>
+        <w:t xml:space="preserve">?</w:t>
+      </w:r>
+      <w:r>
+        <w:br/>
+      </w:r>
+      <w:r>
+        <w:rPr>
+          <w:rStyle w:val="VerbatimChar"/>
+        </w:rPr>
+        <w:t xml:space="preserve">git add</w:t>
+      </w:r>
+      <w:r>
+        <w:t xml:space="preserve"> </w:t>
+      </w:r>
+      <w:r>
+        <w:t xml:space="preserve">— добавляет изменения в индекс (подготовка к коммиту);</w:t>
+      </w:r>
+      <w:r>
+        <w:t xml:space="preserve"> </w:t>
+      </w:r>
+      <w:r>
+        <w:rPr>
+          <w:rStyle w:val="VerbatimChar"/>
+        </w:rPr>
+        <w:t xml:space="preserve">git commit</w:t>
+      </w:r>
+      <w:r>
+        <w:t xml:space="preserve"> </w:t>
+      </w:r>
+      <w:r>
+        <w:t xml:space="preserve">— сохраняет изменения в локальную историю с комментарием.</w:t>
       </w:r>
     </w:p>
     <w:p>
@@ -1036,62 +977,17 @@
         <w:pStyle w:val="BodyText"/>
       </w:pPr>
       <w:r>
-        <w:t xml:space="preserve">Отключаю SELinux</w:t>
-      </w:r>
-    </w:p>
-    <w:p>
-      <w:pPr>
-        <w:pStyle w:val="CaptionedFigure"/>
-      </w:pPr>
-      <w:r>
-        <w:drawing>
-          <wp:inline>
-            <wp:extent cx="3733800" cy="715051"/>
-            <wp:effectExtent b="0" l="0" r="0" t="0"/>
-            <wp:docPr descr="Рис. 6" title="" id="60" name="Picture"/>
-            <a:graphic>
-              <a:graphicData uri="http://schemas.openxmlformats.org/drawingml/2006/picture">
-                <pic:pic>
-                  <pic:nvPicPr>
-                    <pic:cNvPr descr="image/5.png" id="61" name="Picture"/>
-                    <pic:cNvPicPr>
-                      <a:picLocks noChangeArrowheads="1" noChangeAspect="1"/>
-                    </pic:cNvPicPr>
-                  </pic:nvPicPr>
-                  <pic:blipFill>
-                    <a:blip r:embed="rId35"/>
-                    <a:stretch>
-                      <a:fillRect/>
-                    </a:stretch>
-                  </pic:blipFill>
-                  <pic:spPr bwMode="auto">
-                    <a:xfrm>
-                      <a:off x="0" y="0"/>
-                      <a:ext cx="3733800" cy="715051"/>
-                    </a:xfrm>
-                    <a:prstGeom prst="rect">
-                      <a:avLst/>
-                    </a:prstGeom>
-                    <a:noFill/>
-                    <a:ln w="9525">
-                      <a:noFill/>
-                      <a:headEnd/>
-                      <a:tailEnd/>
-                    </a:ln>
-                  </pic:spPr>
-                </pic:pic>
-              </a:graphicData>
-            </a:graphic>
-          </wp:inline>
-        </w:drawing>
-      </w:r>
-    </w:p>
-    <w:p>
-      <w:pPr>
-        <w:pStyle w:val="ImageCaption"/>
-      </w:pPr>
-      <w:r>
-        <w:t xml:space="preserve">Рис. 6</w:t>
+        <w:rPr>
+          <w:b/>
+          <w:bCs/>
+        </w:rPr>
+        <w:t xml:space="preserve">4. Зачем нужны SSH-ключи в Git?</w:t>
+      </w:r>
+      <w:r>
+        <w:br/>
+      </w:r>
+      <w:r>
+        <w:t xml:space="preserve">Для безопасной аутентификации при подключении к удалённым репозиториям без ввода логина и пароля.</w:t>
       </w:r>
     </w:p>
     <w:p>
@@ -1099,62 +995,30 @@
         <w:pStyle w:val="BodyText"/>
       </w:pPr>
       <w:r>
-        <w:t xml:space="preserve">Настраиваю раскладку клавиатуры</w:t>
-      </w:r>
-    </w:p>
-    <w:p>
-      <w:pPr>
-        <w:pStyle w:val="CaptionedFigure"/>
-      </w:pPr>
-      <w:r>
-        <w:drawing>
-          <wp:inline>
-            <wp:extent cx="3733800" cy="1618634"/>
-            <wp:effectExtent b="0" l="0" r="0" t="0"/>
-            <wp:docPr descr="Рис. 7" title="" id="62" name="Picture"/>
-            <a:graphic>
-              <a:graphicData uri="http://schemas.openxmlformats.org/drawingml/2006/picture">
-                <pic:pic>
-                  <pic:nvPicPr>
-                    <pic:cNvPr descr="image/6.png" id="63" name="Picture"/>
-                    <pic:cNvPicPr>
-                      <a:picLocks noChangeArrowheads="1" noChangeAspect="1"/>
-                    </pic:cNvPicPr>
-                  </pic:nvPicPr>
-                  <pic:blipFill>
-                    <a:blip r:embed="rId38"/>
-                    <a:stretch>
-                      <a:fillRect/>
-                    </a:stretch>
-                  </pic:blipFill>
-                  <pic:spPr bwMode="auto">
-                    <a:xfrm>
-                      <a:off x="0" y="0"/>
-                      <a:ext cx="3733800" cy="1618634"/>
-                    </a:xfrm>
-                    <a:prstGeom prst="rect">
-                      <a:avLst/>
-                    </a:prstGeom>
-                    <a:noFill/>
-                    <a:ln w="9525">
-                      <a:noFill/>
-                      <a:headEnd/>
-                      <a:tailEnd/>
-                    </a:ln>
-                  </pic:spPr>
-                </pic:pic>
-              </a:graphicData>
-            </a:graphic>
-          </wp:inline>
-        </w:drawing>
-      </w:r>
-    </w:p>
-    <w:p>
-      <w:pPr>
-        <w:pStyle w:val="ImageCaption"/>
-      </w:pPr>
-      <w:r>
-        <w:t xml:space="preserve">Рис. 7</w:t>
+        <w:rPr>
+          <w:b/>
+          <w:bCs/>
+        </w:rPr>
+        <w:t xml:space="preserve">5. Чем отличается PGP-подпись коммита?</w:t>
+      </w:r>
+      <w:r>
+        <w:br/>
+      </w:r>
+      <w:r>
+        <w:t xml:space="preserve">Криптографически подтверждает авторство и целостность коммита; на GitHub такие коммиты помечаются как</w:t>
+      </w:r>
+      <w:r>
+        <w:t xml:space="preserve"> </w:t>
+      </w:r>
+      <w:r>
+        <w:rPr>
+          <w:b/>
+          <w:bCs/>
+        </w:rPr>
+        <w:t xml:space="preserve">Verified</w:t>
+      </w:r>
+      <w:r>
+        <w:t xml:space="preserve">.</w:t>
       </w:r>
     </w:p>
     <w:p>
@@ -1162,62 +1026,51 @@
         <w:pStyle w:val="BodyText"/>
       </w:pPr>
       <w:r>
-        <w:t xml:space="preserve">Настраиваю раскладку клавиатуры</w:t>
-      </w:r>
-    </w:p>
-    <w:p>
-      <w:pPr>
-        <w:pStyle w:val="CaptionedFigure"/>
-      </w:pPr>
-      <w:r>
-        <w:drawing>
-          <wp:inline>
-            <wp:extent cx="3733800" cy="1618634"/>
-            <wp:effectExtent b="0" l="0" r="0" t="0"/>
-            <wp:docPr descr="Рис. 7" title="" id="64" name="Picture"/>
-            <a:graphic>
-              <a:graphicData uri="http://schemas.openxmlformats.org/drawingml/2006/picture">
-                <pic:pic>
-                  <pic:nvPicPr>
-                    <pic:cNvPr descr="image/6.png" id="65" name="Picture"/>
-                    <pic:cNvPicPr>
-                      <a:picLocks noChangeArrowheads="1" noChangeAspect="1"/>
-                    </pic:cNvPicPr>
-                  </pic:nvPicPr>
-                  <pic:blipFill>
-                    <a:blip r:embed="rId38"/>
-                    <a:stretch>
-                      <a:fillRect/>
-                    </a:stretch>
-                  </pic:blipFill>
-                  <pic:spPr bwMode="auto">
-                    <a:xfrm>
-                      <a:off x="0" y="0"/>
-                      <a:ext cx="3733800" cy="1618634"/>
-                    </a:xfrm>
-                    <a:prstGeom prst="rect">
-                      <a:avLst/>
-                    </a:prstGeom>
-                    <a:noFill/>
-                    <a:ln w="9525">
-                      <a:noFill/>
-                      <a:headEnd/>
-                      <a:tailEnd/>
-                    </a:ln>
-                  </pic:spPr>
-                </pic:pic>
-              </a:graphicData>
-            </a:graphic>
-          </wp:inline>
-        </w:drawing>
-      </w:r>
-    </w:p>
-    <w:p>
-      <w:pPr>
-        <w:pStyle w:val="ImageCaption"/>
-      </w:pPr>
-      <w:r>
-        <w:t xml:space="preserve">Рис. 7</w:t>
+        <w:rPr>
+          <w:b/>
+          <w:bCs/>
+        </w:rPr>
+        <w:t xml:space="preserve">6. Что делает</w:t>
+      </w:r>
+      <w:r>
+        <w:rPr>
+          <w:b/>
+          <w:bCs/>
+        </w:rPr>
+        <w:t xml:space="preserve"> </w:t>
+      </w:r>
+      <w:r>
+        <w:rPr>
+          <w:rStyle w:val="VerbatimChar"/>
+          <w:b/>
+          <w:bCs/>
+        </w:rPr>
+        <w:t xml:space="preserve">git config --global</w:t>
+      </w:r>
+      <w:r>
+        <w:rPr>
+          <w:b/>
+          <w:bCs/>
+        </w:rPr>
+        <w:t xml:space="preserve">?</w:t>
+      </w:r>
+      <w:r>
+        <w:br/>
+      </w:r>
+      <w:r>
+        <w:t xml:space="preserve">Записывает настройки в глобальный файл</w:t>
+      </w:r>
+      <w:r>
+        <w:t xml:space="preserve"> </w:t>
+      </w:r>
+      <w:r>
+        <w:rPr>
+          <w:rStyle w:val="VerbatimChar"/>
+        </w:rPr>
+        <w:t xml:space="preserve">~/.gitconfig</w:t>
+      </w:r>
+      <w:r>
+        <w:t xml:space="preserve">, применяя их ко всем репозиториям пользователя.</w:t>
       </w:r>
     </w:p>
     <w:p>
@@ -1225,62 +1078,61 @@
         <w:pStyle w:val="BodyText"/>
       </w:pPr>
       <w:r>
-        <w:t xml:space="preserve">Редактирую конфиг под раскладку клавиатуры</w:t>
-      </w:r>
-    </w:p>
-    <w:p>
-      <w:pPr>
-        <w:pStyle w:val="CaptionedFigure"/>
-      </w:pPr>
-      <w:r>
-        <w:drawing>
-          <wp:inline>
-            <wp:extent cx="3733800" cy="406502"/>
-            <wp:effectExtent b="0" l="0" r="0" t="0"/>
-            <wp:docPr descr="Рис. 8" title="" id="66" name="Picture"/>
-            <a:graphic>
-              <a:graphicData uri="http://schemas.openxmlformats.org/drawingml/2006/picture">
-                <pic:pic>
-                  <pic:nvPicPr>
-                    <pic:cNvPr descr="image/7.png" id="67" name="Picture"/>
-                    <pic:cNvPicPr>
-                      <a:picLocks noChangeArrowheads="1" noChangeAspect="1"/>
-                    </pic:cNvPicPr>
-                  </pic:nvPicPr>
-                  <pic:blipFill>
-                    <a:blip r:embed="rId41"/>
-                    <a:stretch>
-                      <a:fillRect/>
-                    </a:stretch>
-                  </pic:blipFill>
-                  <pic:spPr bwMode="auto">
-                    <a:xfrm>
-                      <a:off x="0" y="0"/>
-                      <a:ext cx="3733800" cy="406502"/>
-                    </a:xfrm>
-                    <a:prstGeom prst="rect">
-                      <a:avLst/>
-                    </a:prstGeom>
-                    <a:noFill/>
-                    <a:ln w="9525">
-                      <a:noFill/>
-                      <a:headEnd/>
-                      <a:tailEnd/>
-                    </a:ln>
-                  </pic:spPr>
-                </pic:pic>
-              </a:graphicData>
-            </a:graphic>
-          </wp:inline>
-        </w:drawing>
-      </w:r>
-    </w:p>
-    <w:p>
-      <w:pPr>
-        <w:pStyle w:val="ImageCaption"/>
-      </w:pPr>
-      <w:r>
-        <w:t xml:space="preserve">Рис. 8</w:t>
+        <w:rPr>
+          <w:b/>
+          <w:bCs/>
+        </w:rPr>
+        <w:t xml:space="preserve">7. Зачем нужен</w:t>
+      </w:r>
+      <w:r>
+        <w:rPr>
+          <w:b/>
+          <w:bCs/>
+        </w:rPr>
+        <w:t xml:space="preserve"> </w:t>
+      </w:r>
+      <w:r>
+        <w:rPr>
+          <w:rStyle w:val="VerbatimChar"/>
+          <w:b/>
+          <w:bCs/>
+        </w:rPr>
+        <w:t xml:space="preserve">core.autocrlf</w:t>
+      </w:r>
+      <w:r>
+        <w:rPr>
+          <w:b/>
+          <w:bCs/>
+        </w:rPr>
+        <w:t xml:space="preserve"> </w:t>
+      </w:r>
+      <w:r>
+        <w:rPr>
+          <w:b/>
+          <w:bCs/>
+        </w:rPr>
+        <w:t xml:space="preserve">и какое значение в Linux?</w:t>
+      </w:r>
+      <w:r>
+        <w:br/>
+      </w:r>
+      <w:r>
+        <w:t xml:space="preserve">Управляет преобразованием символов конца строки. В Linux:</w:t>
+      </w:r>
+      <w:r>
+        <w:t xml:space="preserve"> </w:t>
+      </w:r>
+      <w:r>
+        <w:rPr>
+          <w:rStyle w:val="VerbatimChar"/>
+        </w:rPr>
+        <w:t xml:space="preserve">input</w:t>
+      </w:r>
+      <w:r>
+        <w:t xml:space="preserve"> </w:t>
+      </w:r>
+      <w:r>
+        <w:t xml:space="preserve">— конвертирует CRLF→LF при коммите, не меняет при checkout.</w:t>
       </w:r>
     </w:p>
     <w:p>
@@ -1288,62 +1140,45 @@
         <w:pStyle w:val="BodyText"/>
       </w:pPr>
       <w:r>
-        <w:t xml:space="preserve">Устанавливаю pandoc</w:t>
-      </w:r>
-    </w:p>
-    <w:p>
-      <w:pPr>
-        <w:pStyle w:val="CaptionedFigure"/>
-      </w:pPr>
-      <w:r>
-        <w:drawing>
-          <wp:inline>
-            <wp:extent cx="3733800" cy="2518627"/>
-            <wp:effectExtent b="0" l="0" r="0" t="0"/>
-            <wp:docPr descr="Рис. 9" title="" id="68" name="Picture"/>
-            <a:graphic>
-              <a:graphicData uri="http://schemas.openxmlformats.org/drawingml/2006/picture">
-                <pic:pic>
-                  <pic:nvPicPr>
-                    <pic:cNvPr descr="image/8.png" id="69" name="Picture"/>
-                    <pic:cNvPicPr>
-                      <a:picLocks noChangeArrowheads="1" noChangeAspect="1"/>
-                    </pic:cNvPicPr>
-                  </pic:nvPicPr>
-                  <pic:blipFill>
-                    <a:blip r:embed="rId44"/>
-                    <a:stretch>
-                      <a:fillRect/>
-                    </a:stretch>
-                  </pic:blipFill>
-                  <pic:spPr bwMode="auto">
-                    <a:xfrm>
-                      <a:off x="0" y="0"/>
-                      <a:ext cx="3733800" cy="2518627"/>
-                    </a:xfrm>
-                    <a:prstGeom prst="rect">
-                      <a:avLst/>
-                    </a:prstGeom>
-                    <a:noFill/>
-                    <a:ln w="9525">
-                      <a:noFill/>
-                      <a:headEnd/>
-                      <a:tailEnd/>
-                    </a:ln>
-                  </pic:spPr>
-                </pic:pic>
-              </a:graphicData>
-            </a:graphic>
-          </wp:inline>
-        </w:drawing>
-      </w:r>
-    </w:p>
-    <w:p>
-      <w:pPr>
-        <w:pStyle w:val="ImageCaption"/>
-      </w:pPr>
-      <w:r>
-        <w:t xml:space="preserve">Рис. 9</w:t>
+        <w:rPr>
+          <w:b/>
+          <w:bCs/>
+        </w:rPr>
+        <w:t xml:space="preserve">8. Как проверить подпись коммита?</w:t>
+      </w:r>
+      <w:r>
+        <w:br/>
+      </w:r>
+      <w:r>
+        <w:t xml:space="preserve">Локально:</w:t>
+      </w:r>
+      <w:r>
+        <w:t xml:space="preserve"> </w:t>
+      </w:r>
+      <w:r>
+        <w:rPr>
+          <w:rStyle w:val="VerbatimChar"/>
+        </w:rPr>
+        <w:t xml:space="preserve">git log --show-signature</w:t>
+      </w:r>
+      <w:r>
+        <w:t xml:space="preserve">; на GitHub — значок</w:t>
+      </w:r>
+      <w:r>
+        <w:t xml:space="preserve"> </w:t>
+      </w:r>
+      <w:r>
+        <w:rPr>
+          <w:b/>
+          <w:bCs/>
+        </w:rPr>
+        <w:t xml:space="preserve">Verified</w:t>
+      </w:r>
+      <w:r>
+        <w:t xml:space="preserve"> </w:t>
+      </w:r>
+      <w:r>
+        <w:t xml:space="preserve">рядом с коммитом.</w:t>
       </w:r>
     </w:p>
     <w:p>
@@ -1351,62 +1186,224 @@
         <w:pStyle w:val="BodyText"/>
       </w:pPr>
       <w:r>
-        <w:t xml:space="preserve">Устанавливаю TeXlive</w:t>
-      </w:r>
-    </w:p>
-    <w:p>
-      <w:pPr>
-        <w:pStyle w:val="CaptionedFigure"/>
-      </w:pPr>
-      <w:r>
-        <w:drawing>
-          <wp:inline>
-            <wp:extent cx="3733800" cy="556506"/>
-            <wp:effectExtent b="0" l="0" r="0" t="0"/>
-            <wp:docPr descr="Рис. 10" title="" id="70" name="Picture"/>
-            <a:graphic>
-              <a:graphicData uri="http://schemas.openxmlformats.org/drawingml/2006/picture">
-                <pic:pic>
-                  <pic:nvPicPr>
-                    <pic:cNvPr descr="image/9.png" id="71" name="Picture"/>
-                    <pic:cNvPicPr>
-                      <a:picLocks noChangeArrowheads="1" noChangeAspect="1"/>
-                    </pic:cNvPicPr>
-                  </pic:nvPicPr>
-                  <pic:blipFill>
-                    <a:blip r:embed="rId47"/>
-                    <a:stretch>
-                      <a:fillRect/>
-                    </a:stretch>
-                  </pic:blipFill>
-                  <pic:spPr bwMode="auto">
-                    <a:xfrm>
-                      <a:off x="0" y="0"/>
-                      <a:ext cx="3733800" cy="556506"/>
-                    </a:xfrm>
-                    <a:prstGeom prst="rect">
-                      <a:avLst/>
-                    </a:prstGeom>
-                    <a:noFill/>
-                    <a:ln w="9525">
-                      <a:noFill/>
-                      <a:headEnd/>
-                      <a:tailEnd/>
-                    </a:ln>
-                  </pic:spPr>
-                </pic:pic>
-              </a:graphicData>
-            </a:graphic>
-          </wp:inline>
-        </w:drawing>
-      </w:r>
-    </w:p>
-    <w:p>
-      <w:pPr>
-        <w:pStyle w:val="ImageCaption"/>
-      </w:pPr>
-      <w:r>
-        <w:t xml:space="preserve">Рис. 10</w:t>
+        <w:rPr>
+          <w:b/>
+          <w:bCs/>
+        </w:rPr>
+        <w:t xml:space="preserve">9. Что делает</w:t>
+      </w:r>
+      <w:r>
+        <w:rPr>
+          <w:b/>
+          <w:bCs/>
+        </w:rPr>
+        <w:t xml:space="preserve"> </w:t>
+      </w:r>
+      <w:r>
+        <w:rPr>
+          <w:rStyle w:val="VerbatimChar"/>
+          <w:b/>
+          <w:bCs/>
+        </w:rPr>
+        <w:t xml:space="preserve">git flow init</w:t>
+      </w:r>
+      <w:r>
+        <w:rPr>
+          <w:b/>
+          <w:bCs/>
+        </w:rPr>
+        <w:t xml:space="preserve">?</w:t>
+      </w:r>
+      <w:r>
+        <w:br/>
+      </w:r>
+      <w:r>
+        <w:t xml:space="preserve">Инициализирует структуру веток Git Flow: создаёт</w:t>
+      </w:r>
+      <w:r>
+        <w:t xml:space="preserve"> </w:t>
+      </w:r>
+      <w:r>
+        <w:rPr>
+          <w:rStyle w:val="VerbatimChar"/>
+        </w:rPr>
+        <w:t xml:space="preserve">master</w:t>
+      </w:r>
+      <w:r>
+        <w:t xml:space="preserve">,</w:t>
+      </w:r>
+      <w:r>
+        <w:t xml:space="preserve"> </w:t>
+      </w:r>
+      <w:r>
+        <w:rPr>
+          <w:rStyle w:val="VerbatimChar"/>
+        </w:rPr>
+        <w:t xml:space="preserve">develop</w:t>
+      </w:r>
+      <w:r>
+        <w:t xml:space="preserve"> </w:t>
+      </w:r>
+      <w:r>
+        <w:t xml:space="preserve">и настраивает префиксы для</w:t>
+      </w:r>
+      <w:r>
+        <w:t xml:space="preserve"> </w:t>
+      </w:r>
+      <w:r>
+        <w:rPr>
+          <w:rStyle w:val="VerbatimChar"/>
+        </w:rPr>
+        <w:t xml:space="preserve">feature/</w:t>
+      </w:r>
+      <w:r>
+        <w:t xml:space="preserve">,</w:t>
+      </w:r>
+      <w:r>
+        <w:t xml:space="preserve"> </w:t>
+      </w:r>
+      <w:r>
+        <w:rPr>
+          <w:rStyle w:val="VerbatimChar"/>
+        </w:rPr>
+        <w:t xml:space="preserve">release/</w:t>
+      </w:r>
+      <w:r>
+        <w:t xml:space="preserve">,</w:t>
+      </w:r>
+      <w:r>
+        <w:t xml:space="preserve"> </w:t>
+      </w:r>
+      <w:r>
+        <w:rPr>
+          <w:rStyle w:val="VerbatimChar"/>
+        </w:rPr>
+        <w:t xml:space="preserve">hotfix/</w:t>
+      </w:r>
+      <w:r>
+        <w:t xml:space="preserve">.</w:t>
+      </w:r>
+    </w:p>
+    <w:p>
+      <w:pPr>
+        <w:pStyle w:val="BodyText"/>
+      </w:pPr>
+      <w:r>
+        <w:rPr>
+          <w:b/>
+          <w:bCs/>
+        </w:rPr>
+        <w:t xml:space="preserve">10. Как создать и отправить тег версии?</w:t>
+      </w:r>
+    </w:p>
+    <w:p>
+      <w:pPr>
+        <w:pStyle w:val="SourceCode"/>
+      </w:pPr>
+      <w:r>
+        <w:rPr>
+          <w:rStyle w:val="FunctionTok"/>
+        </w:rPr>
+        <w:t xml:space="preserve">git</w:t>
+      </w:r>
+      <w:r>
+        <w:rPr>
+          <w:rStyle w:val="NormalTok"/>
+        </w:rPr>
+        <w:t xml:space="preserve"> tag </w:t>
+      </w:r>
+      <w:r>
+        <w:rPr>
+          <w:rStyle w:val="AttributeTok"/>
+        </w:rPr>
+        <w:t xml:space="preserve">-a</w:t>
+      </w:r>
+      <w:r>
+        <w:rPr>
+          <w:rStyle w:val="NormalTok"/>
+        </w:rPr>
+        <w:t xml:space="preserve"> v1.0.0 </w:t>
+      </w:r>
+      <w:r>
+        <w:rPr>
+          <w:rStyle w:val="AttributeTok"/>
+        </w:rPr>
+        <w:t xml:space="preserve">-m</w:t>
+      </w:r>
+      <w:r>
+        <w:rPr>
+          <w:rStyle w:val="NormalTok"/>
+        </w:rPr>
+        <w:t xml:space="preserve"> </w:t>
+      </w:r>
+      <w:r>
+        <w:rPr>
+          <w:rStyle w:val="StringTok"/>
+        </w:rPr>
+        <w:t xml:space="preserve">"Release"</w:t>
+      </w:r>
+      <w:r>
+        <w:br/>
+      </w:r>
+      <w:r>
+        <w:rPr>
+          <w:rStyle w:val="FunctionTok"/>
+        </w:rPr>
+        <w:t xml:space="preserve">git</w:t>
+      </w:r>
+      <w:r>
+        <w:rPr>
+          <w:rStyle w:val="NormalTok"/>
+        </w:rPr>
+        <w:t xml:space="preserve"> push origin v1.0.0</w:t>
+      </w:r>
+      <w:r>
+        <w:br/>
+      </w:r>
+      <w:r>
+        <w:rPr>
+          <w:rStyle w:val="CommentTok"/>
+        </w:rPr>
+        <w:t xml:space="preserve"># или все теги:</w:t>
+      </w:r>
+      <w:r>
+        <w:br/>
+      </w:r>
+      <w:r>
+        <w:rPr>
+          <w:rStyle w:val="FunctionTok"/>
+        </w:rPr>
+        <w:t xml:space="preserve">git</w:t>
+      </w:r>
+      <w:r>
+        <w:rPr>
+          <w:rStyle w:val="NormalTok"/>
+        </w:rPr>
+        <w:t xml:space="preserve"> push </w:t>
+      </w:r>
+      <w:r>
+        <w:rPr>
+          <w:rStyle w:val="AttributeTok"/>
+        </w:rPr>
+        <w:t xml:space="preserve">--tags</w:t>
+      </w:r>
+    </w:p>
+    <w:bookmarkEnd w:id="55"/>
+    <w:bookmarkStart w:id="56" w:name="выводы"/>
+    <w:p>
+      <w:pPr>
+        <w:pStyle w:val="Heading1"/>
+      </w:pPr>
+      <w:r>
+        <w:t xml:space="preserve">6. Выводы</w:t>
+      </w:r>
+    </w:p>
+    <w:p>
+      <w:pPr>
+        <w:pStyle w:val="FirstParagraph"/>
+      </w:pPr>
+      <w:r>
+        <w:t xml:space="preserve">В ходе выполнения лабораторной работы были приобретены следующие навыки работы с git, gh.</w:t>
       </w:r>
     </w:p>
     <w:p>
@@ -1416,589 +1413,8 @@
         </w:pict>
       </w:r>
     </w:p>
-    <w:bookmarkEnd w:id="72"/>
-    <w:bookmarkEnd w:id="73"/>
-    <w:bookmarkStart w:id="74" w:name="контрольные-вопросы"/>
-    <w:p>
-      <w:pPr>
-        <w:pStyle w:val="Heading1"/>
-      </w:pPr>
-      <w:r>
-        <w:t xml:space="preserve">5. Контрольные вопросы</w:t>
-      </w:r>
-    </w:p>
-    <w:p>
-      <w:pPr>
-        <w:pStyle w:val="FirstParagraph"/>
-      </w:pPr>
-      <w:r>
-        <w:rPr>
-          <w:b/>
-          <w:bCs/>
-        </w:rPr>
-        <w:t xml:space="preserve">1. Что такое система контроля версий?</w:t>
-      </w:r>
-      <w:r>
-        <w:br/>
-      </w:r>
-      <w:r>
-        <w:t xml:space="preserve">Инструмент для фиксации изменений в файлах, позволяющий отслеживать историю, возвращаться к предыдущим версиям и совмещать правки разных авторов.</w:t>
-      </w:r>
-    </w:p>
-    <w:p>
-      <w:pPr>
-        <w:pStyle w:val="BodyText"/>
-      </w:pPr>
-      <w:r>
-        <w:rPr>
-          <w:b/>
-          <w:bCs/>
-        </w:rPr>
-        <w:t xml:space="preserve">2. Централизованные и распределённые VCS: в чём разница?</w:t>
-      </w:r>
-      <w:r>
-        <w:br/>
-      </w:r>
-      <w:r>
-        <w:t xml:space="preserve">Централизованные (SVN) хранят историю на одном сервере; распределённые (Git) дают каждому участнику полную копию репозитория, позволяя работать офлайн.</w:t>
-      </w:r>
-    </w:p>
-    <w:p>
-      <w:pPr>
-        <w:pStyle w:val="BodyText"/>
-      </w:pPr>
-      <w:r>
-        <w:rPr>
-          <w:b/>
-          <w:bCs/>
-        </w:rPr>
-        <w:t xml:space="preserve">3. Для чего нужны</w:t>
-      </w:r>
-      <w:r>
-        <w:rPr>
-          <w:b/>
-          <w:bCs/>
-        </w:rPr>
-        <w:t xml:space="preserve"> </w:t>
-      </w:r>
-      <w:r>
-        <w:rPr>
-          <w:rStyle w:val="VerbatimChar"/>
-          <w:b/>
-          <w:bCs/>
-        </w:rPr>
-        <w:t xml:space="preserve">git add</w:t>
-      </w:r>
-      <w:r>
-        <w:rPr>
-          <w:b/>
-          <w:bCs/>
-        </w:rPr>
-        <w:t xml:space="preserve"> </w:t>
-      </w:r>
-      <w:r>
-        <w:rPr>
-          <w:b/>
-          <w:bCs/>
-        </w:rPr>
-        <w:t xml:space="preserve">и</w:t>
-      </w:r>
-      <w:r>
-        <w:rPr>
-          <w:b/>
-          <w:bCs/>
-        </w:rPr>
-        <w:t xml:space="preserve"> </w:t>
-      </w:r>
-      <w:r>
-        <w:rPr>
-          <w:rStyle w:val="VerbatimChar"/>
-          <w:b/>
-          <w:bCs/>
-        </w:rPr>
-        <w:t xml:space="preserve">git commit</w:t>
-      </w:r>
-      <w:r>
-        <w:rPr>
-          <w:b/>
-          <w:bCs/>
-        </w:rPr>
-        <w:t xml:space="preserve">?</w:t>
-      </w:r>
-      <w:r>
-        <w:br/>
-      </w:r>
-      <w:r>
-        <w:rPr>
-          <w:rStyle w:val="VerbatimChar"/>
-        </w:rPr>
-        <w:t xml:space="preserve">git add</w:t>
-      </w:r>
-      <w:r>
-        <w:t xml:space="preserve"> </w:t>
-      </w:r>
-      <w:r>
-        <w:t xml:space="preserve">— добавляет изменения в индекс (подготовка к коммиту);</w:t>
-      </w:r>
-      <w:r>
-        <w:t xml:space="preserve"> </w:t>
-      </w:r>
-      <w:r>
-        <w:rPr>
-          <w:rStyle w:val="VerbatimChar"/>
-        </w:rPr>
-        <w:t xml:space="preserve">git commit</w:t>
-      </w:r>
-      <w:r>
-        <w:t xml:space="preserve"> </w:t>
-      </w:r>
-      <w:r>
-        <w:t xml:space="preserve">— сохраняет изменения в локальную историю с комментарием.</w:t>
-      </w:r>
-    </w:p>
-    <w:p>
-      <w:pPr>
-        <w:pStyle w:val="BodyText"/>
-      </w:pPr>
-      <w:r>
-        <w:rPr>
-          <w:b/>
-          <w:bCs/>
-        </w:rPr>
-        <w:t xml:space="preserve">4. Зачем нужны SSH-ключи в Git?</w:t>
-      </w:r>
-      <w:r>
-        <w:br/>
-      </w:r>
-      <w:r>
-        <w:t xml:space="preserve">Для безопасной аутентификации при подключении к удалённым репозиториям без ввода логина и пароля.</w:t>
-      </w:r>
-    </w:p>
-    <w:p>
-      <w:pPr>
-        <w:pStyle w:val="BodyText"/>
-      </w:pPr>
-      <w:r>
-        <w:rPr>
-          <w:b/>
-          <w:bCs/>
-        </w:rPr>
-        <w:t xml:space="preserve">5. Чем отличается PGP-подпись коммита?</w:t>
-      </w:r>
-      <w:r>
-        <w:br/>
-      </w:r>
-      <w:r>
-        <w:t xml:space="preserve">Криптографически подтверждает авторство и целостность коммита; на GitHub такие коммиты помечаются как</w:t>
-      </w:r>
-      <w:r>
-        <w:t xml:space="preserve"> </w:t>
-      </w:r>
-      <w:r>
-        <w:rPr>
-          <w:b/>
-          <w:bCs/>
-        </w:rPr>
-        <w:t xml:space="preserve">Verified</w:t>
-      </w:r>
-      <w:r>
-        <w:t xml:space="preserve">.</w:t>
-      </w:r>
-    </w:p>
-    <w:p>
-      <w:pPr>
-        <w:pStyle w:val="BodyText"/>
-      </w:pPr>
-      <w:r>
-        <w:rPr>
-          <w:b/>
-          <w:bCs/>
-        </w:rPr>
-        <w:t xml:space="preserve">6. Что делает</w:t>
-      </w:r>
-      <w:r>
-        <w:rPr>
-          <w:b/>
-          <w:bCs/>
-        </w:rPr>
-        <w:t xml:space="preserve"> </w:t>
-      </w:r>
-      <w:r>
-        <w:rPr>
-          <w:rStyle w:val="VerbatimChar"/>
-          <w:b/>
-          <w:bCs/>
-        </w:rPr>
-        <w:t xml:space="preserve">git config --global</w:t>
-      </w:r>
-      <w:r>
-        <w:rPr>
-          <w:b/>
-          <w:bCs/>
-        </w:rPr>
-        <w:t xml:space="preserve">?</w:t>
-      </w:r>
-      <w:r>
-        <w:br/>
-      </w:r>
-      <w:r>
-        <w:t xml:space="preserve">Записывает настройки в глобальный файл</w:t>
-      </w:r>
-      <w:r>
-        <w:t xml:space="preserve"> </w:t>
-      </w:r>
-      <w:r>
-        <w:rPr>
-          <w:rStyle w:val="VerbatimChar"/>
-        </w:rPr>
-        <w:t xml:space="preserve">~/.gitconfig</w:t>
-      </w:r>
-      <w:r>
-        <w:t xml:space="preserve">, применяя их ко всем репозиториям пользователя.</w:t>
-      </w:r>
-    </w:p>
-    <w:p>
-      <w:pPr>
-        <w:pStyle w:val="BodyText"/>
-      </w:pPr>
-      <w:r>
-        <w:rPr>
-          <w:b/>
-          <w:bCs/>
-        </w:rPr>
-        <w:t xml:space="preserve">7. Зачем нужен</w:t>
-      </w:r>
-      <w:r>
-        <w:rPr>
-          <w:b/>
-          <w:bCs/>
-        </w:rPr>
-        <w:t xml:space="preserve"> </w:t>
-      </w:r>
-      <w:r>
-        <w:rPr>
-          <w:rStyle w:val="VerbatimChar"/>
-          <w:b/>
-          <w:bCs/>
-        </w:rPr>
-        <w:t xml:space="preserve">core.autocrlf</w:t>
-      </w:r>
-      <w:r>
-        <w:rPr>
-          <w:b/>
-          <w:bCs/>
-        </w:rPr>
-        <w:t xml:space="preserve"> </w:t>
-      </w:r>
-      <w:r>
-        <w:rPr>
-          <w:b/>
-          <w:bCs/>
-        </w:rPr>
-        <w:t xml:space="preserve">и какое значение в Linux?</w:t>
-      </w:r>
-      <w:r>
-        <w:br/>
-      </w:r>
-      <w:r>
-        <w:t xml:space="preserve">Управляет преобразованием символов конца строки. В Linux:</w:t>
-      </w:r>
-      <w:r>
-        <w:t xml:space="preserve"> </w:t>
-      </w:r>
-      <w:r>
-        <w:rPr>
-          <w:rStyle w:val="VerbatimChar"/>
-        </w:rPr>
-        <w:t xml:space="preserve">input</w:t>
-      </w:r>
-      <w:r>
-        <w:t xml:space="preserve"> </w:t>
-      </w:r>
-      <w:r>
-        <w:t xml:space="preserve">— конвертирует CRLF→LF при коммите, не меняет при checkout.</w:t>
-      </w:r>
-    </w:p>
-    <w:p>
-      <w:pPr>
-        <w:pStyle w:val="BodyText"/>
-      </w:pPr>
-      <w:r>
-        <w:rPr>
-          <w:b/>
-          <w:bCs/>
-        </w:rPr>
-        <w:t xml:space="preserve">8. Как проверить подпись коммита?</w:t>
-      </w:r>
-      <w:r>
-        <w:br/>
-      </w:r>
-      <w:r>
-        <w:t xml:space="preserve">Локально:</w:t>
-      </w:r>
-      <w:r>
-        <w:t xml:space="preserve"> </w:t>
-      </w:r>
-      <w:r>
-        <w:rPr>
-          <w:rStyle w:val="VerbatimChar"/>
-        </w:rPr>
-        <w:t xml:space="preserve">git log --show-signature</w:t>
-      </w:r>
-      <w:r>
-        <w:t xml:space="preserve">; на GitHub — значок</w:t>
-      </w:r>
-      <w:r>
-        <w:t xml:space="preserve"> </w:t>
-      </w:r>
-      <w:r>
-        <w:rPr>
-          <w:b/>
-          <w:bCs/>
-        </w:rPr>
-        <w:t xml:space="preserve">Verified</w:t>
-      </w:r>
-      <w:r>
-        <w:t xml:space="preserve"> </w:t>
-      </w:r>
-      <w:r>
-        <w:t xml:space="preserve">рядом с коммитом.</w:t>
-      </w:r>
-    </w:p>
-    <w:p>
-      <w:pPr>
-        <w:pStyle w:val="BodyText"/>
-      </w:pPr>
-      <w:r>
-        <w:rPr>
-          <w:b/>
-          <w:bCs/>
-        </w:rPr>
-        <w:t xml:space="preserve">9. Что делает</w:t>
-      </w:r>
-      <w:r>
-        <w:rPr>
-          <w:b/>
-          <w:bCs/>
-        </w:rPr>
-        <w:t xml:space="preserve"> </w:t>
-      </w:r>
-      <w:r>
-        <w:rPr>
-          <w:rStyle w:val="VerbatimChar"/>
-          <w:b/>
-          <w:bCs/>
-        </w:rPr>
-        <w:t xml:space="preserve">git flow init</w:t>
-      </w:r>
-      <w:r>
-        <w:rPr>
-          <w:b/>
-          <w:bCs/>
-        </w:rPr>
-        <w:t xml:space="preserve">?</w:t>
-      </w:r>
-      <w:r>
-        <w:br/>
-      </w:r>
-      <w:r>
-        <w:t xml:space="preserve">Инициализирует структуру веток Git Flow: создаёт</w:t>
-      </w:r>
-      <w:r>
-        <w:t xml:space="preserve"> </w:t>
-      </w:r>
-      <w:r>
-        <w:rPr>
-          <w:rStyle w:val="VerbatimChar"/>
-        </w:rPr>
-        <w:t xml:space="preserve">master</w:t>
-      </w:r>
-      <w:r>
-        <w:t xml:space="preserve">,</w:t>
-      </w:r>
-      <w:r>
-        <w:t xml:space="preserve"> </w:t>
-      </w:r>
-      <w:r>
-        <w:rPr>
-          <w:rStyle w:val="VerbatimChar"/>
-        </w:rPr>
-        <w:t xml:space="preserve">develop</w:t>
-      </w:r>
-      <w:r>
-        <w:t xml:space="preserve"> </w:t>
-      </w:r>
-      <w:r>
-        <w:t xml:space="preserve">и настраивает префиксы для</w:t>
-      </w:r>
-      <w:r>
-        <w:t xml:space="preserve"> </w:t>
-      </w:r>
-      <w:r>
-        <w:rPr>
-          <w:rStyle w:val="VerbatimChar"/>
-        </w:rPr>
-        <w:t xml:space="preserve">feature/</w:t>
-      </w:r>
-      <w:r>
-        <w:t xml:space="preserve">,</w:t>
-      </w:r>
-      <w:r>
-        <w:t xml:space="preserve"> </w:t>
-      </w:r>
-      <w:r>
-        <w:rPr>
-          <w:rStyle w:val="VerbatimChar"/>
-        </w:rPr>
-        <w:t xml:space="preserve">release/</w:t>
-      </w:r>
-      <w:r>
-        <w:t xml:space="preserve">,</w:t>
-      </w:r>
-      <w:r>
-        <w:t xml:space="preserve"> </w:t>
-      </w:r>
-      <w:r>
-        <w:rPr>
-          <w:rStyle w:val="VerbatimChar"/>
-        </w:rPr>
-        <w:t xml:space="preserve">hotfix/</w:t>
-      </w:r>
-      <w:r>
-        <w:t xml:space="preserve">.</w:t>
-      </w:r>
-    </w:p>
-    <w:p>
-      <w:pPr>
-        <w:pStyle w:val="BodyText"/>
-      </w:pPr>
-      <w:r>
-        <w:rPr>
-          <w:b/>
-          <w:bCs/>
-        </w:rPr>
-        <w:t xml:space="preserve">10. Как создать и отправить тег версии?</w:t>
-      </w:r>
-    </w:p>
-    <w:p>
-      <w:pPr>
-        <w:pStyle w:val="SourceCode"/>
-      </w:pPr>
-      <w:r>
-        <w:rPr>
-          <w:rStyle w:val="FunctionTok"/>
-        </w:rPr>
-        <w:t xml:space="preserve">git</w:t>
-      </w:r>
-      <w:r>
-        <w:rPr>
-          <w:rStyle w:val="NormalTok"/>
-        </w:rPr>
-        <w:t xml:space="preserve"> tag </w:t>
-      </w:r>
-      <w:r>
-        <w:rPr>
-          <w:rStyle w:val="AttributeTok"/>
-        </w:rPr>
-        <w:t xml:space="preserve">-a</w:t>
-      </w:r>
-      <w:r>
-        <w:rPr>
-          <w:rStyle w:val="NormalTok"/>
-        </w:rPr>
-        <w:t xml:space="preserve"> v1.0.0 </w:t>
-      </w:r>
-      <w:r>
-        <w:rPr>
-          <w:rStyle w:val="AttributeTok"/>
-        </w:rPr>
-        <w:t xml:space="preserve">-m</w:t>
-      </w:r>
-      <w:r>
-        <w:rPr>
-          <w:rStyle w:val="NormalTok"/>
-        </w:rPr>
-        <w:t xml:space="preserve"> </w:t>
-      </w:r>
-      <w:r>
-        <w:rPr>
-          <w:rStyle w:val="StringTok"/>
-        </w:rPr>
-        <w:t xml:space="preserve">"Release"</w:t>
-      </w:r>
-      <w:r>
-        <w:br/>
-      </w:r>
-      <w:r>
-        <w:rPr>
-          <w:rStyle w:val="FunctionTok"/>
-        </w:rPr>
-        <w:t xml:space="preserve">git</w:t>
-      </w:r>
-      <w:r>
-        <w:rPr>
-          <w:rStyle w:val="NormalTok"/>
-        </w:rPr>
-        <w:t xml:space="preserve"> push origin v1.0.0</w:t>
-      </w:r>
-      <w:r>
-        <w:br/>
-      </w:r>
-      <w:r>
-        <w:rPr>
-          <w:rStyle w:val="CommentTok"/>
-        </w:rPr>
-        <w:t xml:space="preserve"># или все теги:</w:t>
-      </w:r>
-      <w:r>
-        <w:br/>
-      </w:r>
-      <w:r>
-        <w:rPr>
-          <w:rStyle w:val="FunctionTok"/>
-        </w:rPr>
-        <w:t xml:space="preserve">git</w:t>
-      </w:r>
-      <w:r>
-        <w:rPr>
-          <w:rStyle w:val="NormalTok"/>
-        </w:rPr>
-        <w:t xml:space="preserve"> push </w:t>
-      </w:r>
-      <w:r>
-        <w:rPr>
-          <w:rStyle w:val="AttributeTok"/>
-        </w:rPr>
-        <w:t xml:space="preserve">--tags</w:t>
-      </w:r>
-    </w:p>
-    <w:bookmarkEnd w:id="74"/>
-    <w:bookmarkStart w:id="75" w:name="выводы"/>
-    <w:p>
-      <w:pPr>
-        <w:pStyle w:val="Heading1"/>
-      </w:pPr>
-      <w:r>
-        <w:t xml:space="preserve">6. Выводы</w:t>
-      </w:r>
-    </w:p>
-    <w:p>
-      <w:pPr>
-        <w:pStyle w:val="FirstParagraph"/>
-      </w:pPr>
-      <w:r>
-        <w:t xml:space="preserve">В ходе выполнения лабораторной работы были приобретены следующие навыки работы с git, gh.</w:t>
-      </w:r>
-    </w:p>
-    <w:p>
-      <w:r>
-        <w:pict>
-          <v:rect style="width:0;height:1.5pt" o:hralign="center" o:hrstd="t" o:hr="t"/>
-        </w:pict>
-      </w:r>
-    </w:p>
-    <w:bookmarkEnd w:id="75"/>
-    <w:bookmarkStart w:id="76" w:name="список-литературы"/>
+    <w:bookmarkEnd w:id="56"/>
+    <w:bookmarkStart w:id="57" w:name="список-литературы"/>
     <w:p>
       <w:pPr>
         <w:pStyle w:val="Heading1"/>
@@ -2103,7 +1519,7 @@
         <w:t xml:space="preserve">ГОСТ 7.32-2001. Отчёт о научно-исследовательской работе. Структура и правила оформления.</w:t>
       </w:r>
     </w:p>
-    <w:bookmarkEnd w:id="76"/>
+    <w:bookmarkEnd w:id="57"/>
     <w:sectPr>
       <w:footnotePr>
         <w:numRestart w:val="eachSect"/>

</xml_diff>